<commit_message>
Organise articles by issue and improve search visibility
</commit_message>
<xml_diff>
--- a/MASTER_PROMPT.docx
+++ b/MASTER_PROMPT.docx
@@ -2552,6 +2552,44 @@
     <w:p>
       <w:r>
         <w:t>The journal ISSN is a journal-wide identifier. It must be editable from Site details and displayed publicly with IJABE journal information.</w:t>
+      </w:r>
+    </w:p>
+    <w:p>
+      <w:pPr>
+        <w:pStyle w:val="Heading1"/>
+      </w:pPr>
+      <w:r>
+        <w:t>Content Organisation, Editorial Contacts and Search Visibility Update - July 2026</w:t>
+      </w:r>
+    </w:p>
+    <w:p>
+      <w:r>
+        <w:t>- Organise article management by journal issue: each issue expands to show only its own articles, and new articles must be created within a selected issue.</w:t>
+      </w:r>
+    </w:p>
+    <w:p>
+      <w:r>
+        <w:t>- On the public website, article cards must show a short preview of no more than four lines and a clear Read more link to the full article page.</w:t>
+      </w:r>
+    </w:p>
+    <w:p>
+      <w:r>
+        <w:t>- Show About IJABE immediately before the management profiles on the homepage.</w:t>
+      </w:r>
+    </w:p>
+    <w:p>
+      <w:r>
+        <w:t>- Allow the administrator to maintain Chief Editor, Managing Editor, and Secretary contact names and phone numbers. Show completed details on the public Contact page.</w:t>
+      </w:r>
+    </w:p>
+    <w:p>
+      <w:r>
+        <w:t>- Make every published article discoverable by search engines using an article page with clear metadata, ScholarlyArticle structured data, crawl permissions, and a sitemap that lists published article URLs.</w:t>
+      </w:r>
+    </w:p>
+    <w:p>
+      <w:r>
+        <w:t>- Do not require a manual database migration for these content additions. Existing saved contact information must remain usable and receive sensible editorial-contact defaults.</w:t>
       </w:r>
     </w:p>
     <w:sectPr>

</xml_diff>